<commit_message>
Add trajectory plots and embed them in the lab worksheet
Generate 10-replicate allele-frequency vs generation plots for all six
simulations (styled like the evobir wf_model app, matching each table's
Run 1) and embed them in Lab09_PopGenetics_Completed.docx.

Co-Authored-By: Claude Opus 4.8 <noreply@anthropic.com>
Claude-Session: https://claude.ai/code/session_014yNjn4N7T6xmeEa4QfARsK
</commit_message>
<xml_diff>
--- a/Lab09_PopGenetics_Completed.docx
+++ b/Lab09_PopGenetics_Completed.docx
@@ -279,6 +279,58 @@
     </w:tbl>
     <w:p/>
     <w:p>
+      <w:pPr>
+        <w:jc w:val="center"/>
+      </w:pPr>
+      <w:r>
+        <w:drawing>
+          <wp:inline xmlns:a="http://schemas.openxmlformats.org/drawingml/2006/main" xmlns:pic="http://schemas.openxmlformats.org/drawingml/2006/picture">
+            <wp:extent cx="4846320" cy="2977025"/>
+            <wp:docPr id="1" name="Picture 1"/>
+            <wp:cNvGraphicFramePr>
+              <a:graphicFrameLocks noChangeAspect="1"/>
+            </wp:cNvGraphicFramePr>
+            <a:graphic>
+              <a:graphicData uri="http://schemas.openxmlformats.org/drawingml/2006/picture">
+                <pic:pic>
+                  <pic:nvPicPr>
+                    <pic:cNvPr id="0" name="sim1.png"/>
+                    <pic:cNvPicPr/>
+                  </pic:nvPicPr>
+                  <pic:blipFill>
+                    <a:blip r:embed="rId9"/>
+                    <a:stretch>
+                      <a:fillRect/>
+                    </a:stretch>
+                  </pic:blipFill>
+                  <pic:spPr>
+                    <a:xfrm>
+                      <a:off x="0" y="0"/>
+                      <a:ext cx="4846320" cy="2977025"/>
+                    </a:xfrm>
+                    <a:prstGeom prst="rect"/>
+                  </pic:spPr>
+                </pic:pic>
+              </a:graphicData>
+            </a:graphic>
+          </wp:inline>
+        </w:drawing>
+      </w:r>
+    </w:p>
+    <w:p>
+      <w:pPr>
+        <w:jc w:val="center"/>
+      </w:pPr>
+      <w:r>
+        <w:rPr>
+          <w:i/>
+          <w:sz w:val="16"/>
+        </w:rPr>
+        <w:t>Representative output (Run 1): frequency of A across 10 replicate populations over 100 generations.</w:t>
+      </w:r>
+    </w:p>
+    <w:p/>
+    <w:p>
       <w:r>
         <w:rPr>
           <w:b/>
@@ -554,6 +606,58 @@
         </w:tc>
       </w:tr>
     </w:tbl>
+    <w:p/>
+    <w:p>
+      <w:pPr>
+        <w:jc w:val="center"/>
+      </w:pPr>
+      <w:r>
+        <w:drawing>
+          <wp:inline xmlns:a="http://schemas.openxmlformats.org/drawingml/2006/main" xmlns:pic="http://schemas.openxmlformats.org/drawingml/2006/picture">
+            <wp:extent cx="4846320" cy="2977025"/>
+            <wp:docPr id="2" name="Picture 2"/>
+            <wp:cNvGraphicFramePr>
+              <a:graphicFrameLocks noChangeAspect="1"/>
+            </wp:cNvGraphicFramePr>
+            <a:graphic>
+              <a:graphicData uri="http://schemas.openxmlformats.org/drawingml/2006/picture">
+                <pic:pic>
+                  <pic:nvPicPr>
+                    <pic:cNvPr id="0" name="sim2.png"/>
+                    <pic:cNvPicPr/>
+                  </pic:nvPicPr>
+                  <pic:blipFill>
+                    <a:blip r:embed="rId10"/>
+                    <a:stretch>
+                      <a:fillRect/>
+                    </a:stretch>
+                  </pic:blipFill>
+                  <pic:spPr>
+                    <a:xfrm>
+                      <a:off x="0" y="0"/>
+                      <a:ext cx="4846320" cy="2977025"/>
+                    </a:xfrm>
+                    <a:prstGeom prst="rect"/>
+                  </pic:spPr>
+                </pic:pic>
+              </a:graphicData>
+            </a:graphic>
+          </wp:inline>
+        </w:drawing>
+      </w:r>
+    </w:p>
+    <w:p>
+      <w:pPr>
+        <w:jc w:val="center"/>
+      </w:pPr>
+      <w:r>
+        <w:rPr>
+          <w:i/>
+          <w:sz w:val="16"/>
+        </w:rPr>
+        <w:t>Representative output (Run 1): frequency of A across 10 replicate populations over 100 generations.</w:t>
+      </w:r>
+    </w:p>
     <w:p/>
     <w:p>
       <w:r>
@@ -833,6 +937,58 @@
     </w:tbl>
     <w:p/>
     <w:p>
+      <w:pPr>
+        <w:jc w:val="center"/>
+      </w:pPr>
+      <w:r>
+        <w:drawing>
+          <wp:inline xmlns:a="http://schemas.openxmlformats.org/drawingml/2006/main" xmlns:pic="http://schemas.openxmlformats.org/drawingml/2006/picture">
+            <wp:extent cx="4846320" cy="2977025"/>
+            <wp:docPr id="3" name="Picture 3"/>
+            <wp:cNvGraphicFramePr>
+              <a:graphicFrameLocks noChangeAspect="1"/>
+            </wp:cNvGraphicFramePr>
+            <a:graphic>
+              <a:graphicData uri="http://schemas.openxmlformats.org/drawingml/2006/picture">
+                <pic:pic>
+                  <pic:nvPicPr>
+                    <pic:cNvPr id="0" name="sim3.png"/>
+                    <pic:cNvPicPr/>
+                  </pic:nvPicPr>
+                  <pic:blipFill>
+                    <a:blip r:embed="rId11"/>
+                    <a:stretch>
+                      <a:fillRect/>
+                    </a:stretch>
+                  </pic:blipFill>
+                  <pic:spPr>
+                    <a:xfrm>
+                      <a:off x="0" y="0"/>
+                      <a:ext cx="4846320" cy="2977025"/>
+                    </a:xfrm>
+                    <a:prstGeom prst="rect"/>
+                  </pic:spPr>
+                </pic:pic>
+              </a:graphicData>
+            </a:graphic>
+          </wp:inline>
+        </w:drawing>
+      </w:r>
+    </w:p>
+    <w:p>
+      <w:pPr>
+        <w:jc w:val="center"/>
+      </w:pPr>
+      <w:r>
+        <w:rPr>
+          <w:i/>
+          <w:sz w:val="16"/>
+        </w:rPr>
+        <w:t>Representative output (Run 1): frequency of A across 10 replicate populations over 100 generations.</w:t>
+      </w:r>
+    </w:p>
+    <w:p/>
+    <w:p>
       <w:r>
         <w:rPr>
           <w:b/>
@@ -1108,6 +1264,58 @@
         </w:tc>
       </w:tr>
     </w:tbl>
+    <w:p/>
+    <w:p>
+      <w:pPr>
+        <w:jc w:val="center"/>
+      </w:pPr>
+      <w:r>
+        <w:drawing>
+          <wp:inline xmlns:a="http://schemas.openxmlformats.org/drawingml/2006/main" xmlns:pic="http://schemas.openxmlformats.org/drawingml/2006/picture">
+            <wp:extent cx="4846320" cy="2977025"/>
+            <wp:docPr id="4" name="Picture 4"/>
+            <wp:cNvGraphicFramePr>
+              <a:graphicFrameLocks noChangeAspect="1"/>
+            </wp:cNvGraphicFramePr>
+            <a:graphic>
+              <a:graphicData uri="http://schemas.openxmlformats.org/drawingml/2006/picture">
+                <pic:pic>
+                  <pic:nvPicPr>
+                    <pic:cNvPr id="0" name="sim4.png"/>
+                    <pic:cNvPicPr/>
+                  </pic:nvPicPr>
+                  <pic:blipFill>
+                    <a:blip r:embed="rId12"/>
+                    <a:stretch>
+                      <a:fillRect/>
+                    </a:stretch>
+                  </pic:blipFill>
+                  <pic:spPr>
+                    <a:xfrm>
+                      <a:off x="0" y="0"/>
+                      <a:ext cx="4846320" cy="2977025"/>
+                    </a:xfrm>
+                    <a:prstGeom prst="rect"/>
+                  </pic:spPr>
+                </pic:pic>
+              </a:graphicData>
+            </a:graphic>
+          </wp:inline>
+        </w:drawing>
+      </w:r>
+    </w:p>
+    <w:p>
+      <w:pPr>
+        <w:jc w:val="center"/>
+      </w:pPr>
+      <w:r>
+        <w:rPr>
+          <w:i/>
+          <w:sz w:val="16"/>
+        </w:rPr>
+        <w:t>Representative output (Run 1): frequency of A across 10 replicate populations over 100 generations.</w:t>
+      </w:r>
+    </w:p>
     <w:p/>
     <w:p>
       <w:r>
@@ -1387,6 +1595,58 @@
     </w:tbl>
     <w:p/>
     <w:p>
+      <w:pPr>
+        <w:jc w:val="center"/>
+      </w:pPr>
+      <w:r>
+        <w:drawing>
+          <wp:inline xmlns:a="http://schemas.openxmlformats.org/drawingml/2006/main" xmlns:pic="http://schemas.openxmlformats.org/drawingml/2006/picture">
+            <wp:extent cx="4846320" cy="2977025"/>
+            <wp:docPr id="5" name="Picture 5"/>
+            <wp:cNvGraphicFramePr>
+              <a:graphicFrameLocks noChangeAspect="1"/>
+            </wp:cNvGraphicFramePr>
+            <a:graphic>
+              <a:graphicData uri="http://schemas.openxmlformats.org/drawingml/2006/picture">
+                <pic:pic>
+                  <pic:nvPicPr>
+                    <pic:cNvPr id="0" name="sim5.png"/>
+                    <pic:cNvPicPr/>
+                  </pic:nvPicPr>
+                  <pic:blipFill>
+                    <a:blip r:embed="rId13"/>
+                    <a:stretch>
+                      <a:fillRect/>
+                    </a:stretch>
+                  </pic:blipFill>
+                  <pic:spPr>
+                    <a:xfrm>
+                      <a:off x="0" y="0"/>
+                      <a:ext cx="4846320" cy="2977025"/>
+                    </a:xfrm>
+                    <a:prstGeom prst="rect"/>
+                  </pic:spPr>
+                </pic:pic>
+              </a:graphicData>
+            </a:graphic>
+          </wp:inline>
+        </w:drawing>
+      </w:r>
+    </w:p>
+    <w:p>
+      <w:pPr>
+        <w:jc w:val="center"/>
+      </w:pPr>
+      <w:r>
+        <w:rPr>
+          <w:i/>
+          <w:sz w:val="16"/>
+        </w:rPr>
+        <w:t>Representative output (Run 1): frequency of A across 10 replicate populations over 100 generations.</w:t>
+      </w:r>
+    </w:p>
+    <w:p/>
+    <w:p>
       <w:r>
         <w:rPr>
           <w:b/>
@@ -1662,6 +1922,58 @@
         </w:tc>
       </w:tr>
     </w:tbl>
+    <w:p/>
+    <w:p>
+      <w:pPr>
+        <w:jc w:val="center"/>
+      </w:pPr>
+      <w:r>
+        <w:drawing>
+          <wp:inline xmlns:a="http://schemas.openxmlformats.org/drawingml/2006/main" xmlns:pic="http://schemas.openxmlformats.org/drawingml/2006/picture">
+            <wp:extent cx="4846320" cy="2977025"/>
+            <wp:docPr id="6" name="Picture 6"/>
+            <wp:cNvGraphicFramePr>
+              <a:graphicFrameLocks noChangeAspect="1"/>
+            </wp:cNvGraphicFramePr>
+            <a:graphic>
+              <a:graphicData uri="http://schemas.openxmlformats.org/drawingml/2006/picture">
+                <pic:pic>
+                  <pic:nvPicPr>
+                    <pic:cNvPr id="0" name="sim6.png"/>
+                    <pic:cNvPicPr/>
+                  </pic:nvPicPr>
+                  <pic:blipFill>
+                    <a:blip r:embed="rId14"/>
+                    <a:stretch>
+                      <a:fillRect/>
+                    </a:stretch>
+                  </pic:blipFill>
+                  <pic:spPr>
+                    <a:xfrm>
+                      <a:off x="0" y="0"/>
+                      <a:ext cx="4846320" cy="2977025"/>
+                    </a:xfrm>
+                    <a:prstGeom prst="rect"/>
+                  </pic:spPr>
+                </pic:pic>
+              </a:graphicData>
+            </a:graphic>
+          </wp:inline>
+        </w:drawing>
+      </w:r>
+    </w:p>
+    <w:p>
+      <w:pPr>
+        <w:jc w:val="center"/>
+      </w:pPr>
+      <w:r>
+        <w:rPr>
+          <w:i/>
+          <w:sz w:val="16"/>
+        </w:rPr>
+        <w:t>Representative output (Run 1): frequency of A across 10 replicate populations over 100 generations.</w:t>
+      </w:r>
+    </w:p>
     <w:p/>
     <w:p>
       <w:r>

</xml_diff>

<commit_message>
Simplify worksheet formatting to plain single-font style
Remove colored/italic answer styling and varied font sizes; use a single
plain font (Times New Roman 12) throughout with bold only for headings and
questions.
</commit_message>
<xml_diff>
--- a/Lab09_PopGenetics_Completed.docx
+++ b/Lab09_PopGenetics_Completed.docx
@@ -3,36 +3,16 @@
 <w:document xmlns:wpc="http://schemas.microsoft.com/office/word/2010/wordprocessingCanvas" xmlns:mo="http://schemas.microsoft.com/office/mac/office/2008/main" xmlns:mc="http://schemas.openxmlformats.org/markup-compatibility/2006" xmlns:mv="urn:schemas-microsoft-com:mac:vml" xmlns:o="urn:schemas-microsoft-com:office:office" xmlns:r="http://schemas.openxmlformats.org/officeDocument/2006/relationships" xmlns:m="http://schemas.openxmlformats.org/officeDocument/2006/math" xmlns:v="urn:schemas-microsoft-com:vml" xmlns:wp14="http://schemas.microsoft.com/office/word/2010/wordprocessingDrawing" xmlns:wp="http://schemas.openxmlformats.org/drawingml/2006/wordprocessingDrawing" xmlns:w10="urn:schemas-microsoft-com:office:word" xmlns:w="http://schemas.openxmlformats.org/wordprocessingml/2006/main" xmlns:w14="http://schemas.microsoft.com/office/word/2010/wordml" xmlns:wpg="http://schemas.microsoft.com/office/word/2010/wordprocessingGroup" xmlns:wpi="http://schemas.microsoft.com/office/word/2010/wordprocessingInk" xmlns:wne="http://schemas.microsoft.com/office/word/2006/wordml" xmlns:wps="http://schemas.microsoft.com/office/word/2010/wordprocessingShape" mc:Ignorable="w14 wp14">
   <w:body>
     <w:p>
-      <w:pPr>
-        <w:jc w:val="center"/>
-      </w:pPr>
       <w:r>
         <w:rPr>
           <w:b/>
-          <w:sz w:val="36"/>
         </w:rPr>
         <w:t>Lab 9: Population Genetics</w:t>
       </w:r>
     </w:p>
     <w:p>
-      <w:pPr>
-        <w:jc w:val="center"/>
-      </w:pPr>
       <w:r>
-        <w:rPr>
-          <w:sz w:val="24"/>
-        </w:rPr>
-        <w:t>Exercise Worksheet — Completed</w:t>
-      </w:r>
-    </w:p>
-    <w:p/>
-    <w:p>
-      <w:r>
-        <w:rPr>
-          <w:i/>
-          <w:sz w:val="18"/>
-        </w:rPr>
-        <w:t>Simulator: Wright-Fisher drift/selection model (https://evobir.shinyapps.io/wf_model/). Each run = 10 replicate populations evolved for 100 generations; the tables record how many of the 10 replicates ended with allele A fixed (f(A)=1) or lost (f(A)=0). Answers in blue.</w:t>
+        <w:t>Exercise worksheet. Simulator: Wright-Fisher drift/selection model (https://evobir.shinyapps.io/wf_model/). Each run uses 10 replicate populations over 100 generations; the tables record how many of the 10 replicates ended with allele A fixed (f(A)=1) or lost (f(A)=0).</w:t>
       </w:r>
     </w:p>
     <w:p/>
@@ -40,7 +20,6 @@
       <w:r>
         <w:rPr>
           <w:b/>
-          <w:sz w:val="26"/>
         </w:rPr>
         <w:t>SIMULATION 1 — N = 100, initial f(A) = 0.5, all selection coefficients = 1.0</w:t>
       </w:r>
@@ -103,9 +82,6 @@
           </w:tcPr>
           <w:p>
             <w:r>
-              <w:rPr>
-                <w:color w:val="1F4E79"/>
-              </w:rPr>
               <w:t>2</w:t>
             </w:r>
           </w:p>
@@ -116,9 +92,6 @@
           </w:tcPr>
           <w:p>
             <w:r>
-              <w:rPr>
-                <w:color w:val="1F4E79"/>
-              </w:rPr>
               <w:t>1</w:t>
             </w:r>
           </w:p>
@@ -141,9 +114,6 @@
           </w:tcPr>
           <w:p>
             <w:r>
-              <w:rPr>
-                <w:color w:val="1F4E79"/>
-              </w:rPr>
               <w:t>1</w:t>
             </w:r>
           </w:p>
@@ -154,9 +124,6 @@
           </w:tcPr>
           <w:p>
             <w:r>
-              <w:rPr>
-                <w:color w:val="1F4E79"/>
-              </w:rPr>
               <w:t>0</w:t>
             </w:r>
           </w:p>
@@ -179,9 +146,6 @@
           </w:tcPr>
           <w:p>
             <w:r>
-              <w:rPr>
-                <w:color w:val="1F4E79"/>
-              </w:rPr>
               <w:t>0</w:t>
             </w:r>
           </w:p>
@@ -192,9 +156,6 @@
           </w:tcPr>
           <w:p>
             <w:r>
-              <w:rPr>
-                <w:color w:val="1F4E79"/>
-              </w:rPr>
               <w:t>0</w:t>
             </w:r>
           </w:p>
@@ -217,9 +178,6 @@
           </w:tcPr>
           <w:p>
             <w:r>
-              <w:rPr>
-                <w:color w:val="1F4E79"/>
-              </w:rPr>
               <w:t>0</w:t>
             </w:r>
           </w:p>
@@ -230,9 +188,6 @@
           </w:tcPr>
           <w:p>
             <w:r>
-              <w:rPr>
-                <w:color w:val="1F4E79"/>
-              </w:rPr>
               <w:t>0</w:t>
             </w:r>
           </w:p>
@@ -255,9 +210,6 @@
           </w:tcPr>
           <w:p>
             <w:r>
-              <w:rPr>
-                <w:color w:val="1F4E79"/>
-              </w:rPr>
               <w:t>1</w:t>
             </w:r>
           </w:p>
@@ -268,9 +220,6 @@
           </w:tcPr>
           <w:p>
             <w:r>
-              <w:rPr>
-                <w:color w:val="1F4E79"/>
-              </w:rPr>
               <w:t>0</w:t>
             </w:r>
           </w:p>
@@ -323,8 +272,7 @@
       </w:pPr>
       <w:r>
         <w:rPr>
-          <w:i/>
-          <w:sz w:val="16"/>
+          <w:sz w:val="18"/>
         </w:rPr>
         <w:t>Representative output (Run 1): frequency of A across 10 replicate populations over 100 generations.</w:t>
       </w:r>
@@ -340,10 +288,6 @@
     </w:p>
     <w:p>
       <w:r>
-        <w:rPr>
-          <w:i/>
-          <w:color w:val="1F4E79"/>
-        </w:rPr>
         <w:t>No. Genetic drift is a stochastic (random) process: every generation the next set of alleles is sampled at random from the current pool, so each replicate and each run follows a different random walk. With N = 100 and only 100 generations most replicates are still segregating; among the few that resolve, A fixes about as often as it is lost because the starting frequency is 0.5 (fixation probability = 0.5).</w:t>
       </w:r>
     </w:p>
@@ -352,7 +296,6 @@
       <w:r>
         <w:rPr>
           <w:b/>
-          <w:sz w:val="26"/>
         </w:rPr>
         <w:t>SIMULATION 2 — Increase N to 1000, f(A) = 0.5, neutral</w:t>
       </w:r>
@@ -367,10 +310,6 @@
     </w:p>
     <w:p>
       <w:r>
-        <w:rPr>
-          <w:i/>
-          <w:color w:val="1F4E79"/>
-        </w:rPr>
         <w:t>Drift is weaker in large populations, so I predict far fewer replicates will reach fixation or loss within 100 generations — most should stay near 0.5.</w:t>
       </w:r>
     </w:p>
@@ -432,9 +371,6 @@
           </w:tcPr>
           <w:p>
             <w:r>
-              <w:rPr>
-                <w:color w:val="1F4E79"/>
-              </w:rPr>
               <w:t>0</w:t>
             </w:r>
           </w:p>
@@ -445,9 +381,6 @@
           </w:tcPr>
           <w:p>
             <w:r>
-              <w:rPr>
-                <w:color w:val="1F4E79"/>
-              </w:rPr>
               <w:t>0</w:t>
             </w:r>
           </w:p>
@@ -470,9 +403,6 @@
           </w:tcPr>
           <w:p>
             <w:r>
-              <w:rPr>
-                <w:color w:val="1F4E79"/>
-              </w:rPr>
               <w:t>0</w:t>
             </w:r>
           </w:p>
@@ -483,9 +413,6 @@
           </w:tcPr>
           <w:p>
             <w:r>
-              <w:rPr>
-                <w:color w:val="1F4E79"/>
-              </w:rPr>
               <w:t>0</w:t>
             </w:r>
           </w:p>
@@ -508,9 +435,6 @@
           </w:tcPr>
           <w:p>
             <w:r>
-              <w:rPr>
-                <w:color w:val="1F4E79"/>
-              </w:rPr>
               <w:t>0</w:t>
             </w:r>
           </w:p>
@@ -521,9 +445,6 @@
           </w:tcPr>
           <w:p>
             <w:r>
-              <w:rPr>
-                <w:color w:val="1F4E79"/>
-              </w:rPr>
               <w:t>0</w:t>
             </w:r>
           </w:p>
@@ -546,9 +467,6 @@
           </w:tcPr>
           <w:p>
             <w:r>
-              <w:rPr>
-                <w:color w:val="1F4E79"/>
-              </w:rPr>
               <w:t>0</w:t>
             </w:r>
           </w:p>
@@ -559,9 +477,6 @@
           </w:tcPr>
           <w:p>
             <w:r>
-              <w:rPr>
-                <w:color w:val="1F4E79"/>
-              </w:rPr>
               <w:t>0</w:t>
             </w:r>
           </w:p>
@@ -584,9 +499,6 @@
           </w:tcPr>
           <w:p>
             <w:r>
-              <w:rPr>
-                <w:color w:val="1F4E79"/>
-              </w:rPr>
               <w:t>0</w:t>
             </w:r>
           </w:p>
@@ -597,9 +509,6 @@
           </w:tcPr>
           <w:p>
             <w:r>
-              <w:rPr>
-                <w:color w:val="1F4E79"/>
-              </w:rPr>
               <w:t>0</w:t>
             </w:r>
           </w:p>
@@ -652,8 +561,7 @@
       </w:pPr>
       <w:r>
         <w:rPr>
-          <w:i/>
-          <w:sz w:val="16"/>
+          <w:sz w:val="18"/>
         </w:rPr>
         <w:t>Representative output (Run 1): frequency of A across 10 replicate populations over 100 generations.</w:t>
       </w:r>
@@ -669,10 +577,6 @@
     </w:p>
     <w:p>
       <w:r>
-        <w:rPr>
-          <w:i/>
-          <w:color w:val="1F4E79"/>
-        </w:rPr>
         <w:t>Essentially no replicates fixed or were lost; allele frequencies hovered around 0.5. Compared with Simulation 1 (same starting frequency but N = 100, where some replicates fixed/were lost), increasing N suppressed drift. Larger populations experience less sampling error per generation, so allele frequencies change more slowly.</w:t>
       </w:r>
     </w:p>
@@ -681,7 +585,6 @@
       <w:r>
         <w:rPr>
           <w:b/>
-          <w:sz w:val="26"/>
         </w:rPr>
         <w:t>SIMULATION 3 — Back to N = 100, set initial f(A) = 0.1, neutral</w:t>
       </w:r>
@@ -696,10 +599,6 @@
     </w:p>
     <w:p>
       <w:r>
-        <w:rPr>
-          <w:i/>
-          <w:color w:val="1F4E79"/>
-        </w:rPr>
         <w:t>For a neutral allele the probability of fixation equals its initial frequency, so with f(A) = 0.1 only about 1 in 10 replicates should fix A and about 9 in 10 should lose it. I predict mostly losses with the occasional fixation.</w:t>
       </w:r>
     </w:p>
@@ -761,9 +660,6 @@
           </w:tcPr>
           <w:p>
             <w:r>
-              <w:rPr>
-                <w:color w:val="1F4E79"/>
-              </w:rPr>
               <w:t>0</w:t>
             </w:r>
           </w:p>
@@ -774,9 +670,6 @@
           </w:tcPr>
           <w:p>
             <w:r>
-              <w:rPr>
-                <w:color w:val="1F4E79"/>
-              </w:rPr>
               <w:t>6</w:t>
             </w:r>
           </w:p>
@@ -799,9 +692,6 @@
           </w:tcPr>
           <w:p>
             <w:r>
-              <w:rPr>
-                <w:color w:val="1F4E79"/>
-              </w:rPr>
               <w:t>0</w:t>
             </w:r>
           </w:p>
@@ -812,9 +702,6 @@
           </w:tcPr>
           <w:p>
             <w:r>
-              <w:rPr>
-                <w:color w:val="1F4E79"/>
-              </w:rPr>
               <w:t>8</w:t>
             </w:r>
           </w:p>
@@ -837,9 +724,6 @@
           </w:tcPr>
           <w:p>
             <w:r>
-              <w:rPr>
-                <w:color w:val="1F4E79"/>
-              </w:rPr>
               <w:t>0</w:t>
             </w:r>
           </w:p>
@@ -850,9 +734,6 @@
           </w:tcPr>
           <w:p>
             <w:r>
-              <w:rPr>
-                <w:color w:val="1F4E79"/>
-              </w:rPr>
               <w:t>6</w:t>
             </w:r>
           </w:p>
@@ -875,9 +756,6 @@
           </w:tcPr>
           <w:p>
             <w:r>
-              <w:rPr>
-                <w:color w:val="1F4E79"/>
-              </w:rPr>
               <w:t>0</w:t>
             </w:r>
           </w:p>
@@ -888,9 +766,6 @@
           </w:tcPr>
           <w:p>
             <w:r>
-              <w:rPr>
-                <w:color w:val="1F4E79"/>
-              </w:rPr>
               <w:t>7</w:t>
             </w:r>
           </w:p>
@@ -913,9 +788,6 @@
           </w:tcPr>
           <w:p>
             <w:r>
-              <w:rPr>
-                <w:color w:val="1F4E79"/>
-              </w:rPr>
               <w:t>0</w:t>
             </w:r>
           </w:p>
@@ -926,9 +798,6 @@
           </w:tcPr>
           <w:p>
             <w:r>
-              <w:rPr>
-                <w:color w:val="1F4E79"/>
-              </w:rPr>
               <w:t>9</w:t>
             </w:r>
           </w:p>
@@ -981,8 +850,7 @@
       </w:pPr>
       <w:r>
         <w:rPr>
-          <w:i/>
-          <w:sz w:val="16"/>
+          <w:sz w:val="18"/>
         </w:rPr>
         <w:t>Representative output (Run 1): frequency of A across 10 replicate populations over 100 generations.</w:t>
       </w:r>
@@ -998,10 +866,6 @@
     </w:p>
     <w:p>
       <w:r>
-        <w:rPr>
-          <w:i/>
-          <w:color w:val="1F4E79"/>
-        </w:rPr>
         <w:t>Allele A was lost in the large majority of replicates and rarely (if ever) fixed, consistent with a fixation probability of about 0.1. Compared with Simulation 1 (start at 0.5, roughly symmetric fix/loss outcomes), starting rarer makes loss far more likely — the starting frequency sets the fixation probability.</w:t>
       </w:r>
     </w:p>
@@ -1010,7 +874,6 @@
       <w:r>
         <w:rPr>
           <w:b/>
-          <w:sz w:val="26"/>
         </w:rPr>
         <w:t>SIMULATION 4 — N = 1000, keep initial f(A) = 0.1, neutral</w:t>
       </w:r>
@@ -1025,10 +888,6 @@
     </w:p>
     <w:p>
       <w:r>
-        <w:rPr>
-          <w:i/>
-          <w:color w:val="1F4E79"/>
-        </w:rPr>
         <w:t>With a large population drift is weak, so frequencies should stay near 0.1 and few replicates should fix or be lost within 100 generations.</w:t>
       </w:r>
     </w:p>
@@ -1090,9 +949,6 @@
           </w:tcPr>
           <w:p>
             <w:r>
-              <w:rPr>
-                <w:color w:val="1F4E79"/>
-              </w:rPr>
               <w:t>0</w:t>
             </w:r>
           </w:p>
@@ -1103,9 +959,6 @@
           </w:tcPr>
           <w:p>
             <w:r>
-              <w:rPr>
-                <w:color w:val="1F4E79"/>
-              </w:rPr>
               <w:t>1</w:t>
             </w:r>
           </w:p>
@@ -1128,9 +981,6 @@
           </w:tcPr>
           <w:p>
             <w:r>
-              <w:rPr>
-                <w:color w:val="1F4E79"/>
-              </w:rPr>
               <w:t>0</w:t>
             </w:r>
           </w:p>
@@ -1141,9 +991,6 @@
           </w:tcPr>
           <w:p>
             <w:r>
-              <w:rPr>
-                <w:color w:val="1F4E79"/>
-              </w:rPr>
               <w:t>0</w:t>
             </w:r>
           </w:p>
@@ -1166,9 +1013,6 @@
           </w:tcPr>
           <w:p>
             <w:r>
-              <w:rPr>
-                <w:color w:val="1F4E79"/>
-              </w:rPr>
               <w:t>0</w:t>
             </w:r>
           </w:p>
@@ -1179,9 +1023,6 @@
           </w:tcPr>
           <w:p>
             <w:r>
-              <w:rPr>
-                <w:color w:val="1F4E79"/>
-              </w:rPr>
               <w:t>0</w:t>
             </w:r>
           </w:p>
@@ -1204,9 +1045,6 @@
           </w:tcPr>
           <w:p>
             <w:r>
-              <w:rPr>
-                <w:color w:val="1F4E79"/>
-              </w:rPr>
               <w:t>0</w:t>
             </w:r>
           </w:p>
@@ -1217,9 +1055,6 @@
           </w:tcPr>
           <w:p>
             <w:r>
-              <w:rPr>
-                <w:color w:val="1F4E79"/>
-              </w:rPr>
               <w:t>0</w:t>
             </w:r>
           </w:p>
@@ -1242,9 +1077,6 @@
           </w:tcPr>
           <w:p>
             <w:r>
-              <w:rPr>
-                <w:color w:val="1F4E79"/>
-              </w:rPr>
               <w:t>0</w:t>
             </w:r>
           </w:p>
@@ -1255,9 +1087,6 @@
           </w:tcPr>
           <w:p>
             <w:r>
-              <w:rPr>
-                <w:color w:val="1F4E79"/>
-              </w:rPr>
               <w:t>0</w:t>
             </w:r>
           </w:p>
@@ -1310,8 +1139,7 @@
       </w:pPr>
       <w:r>
         <w:rPr>
-          <w:i/>
-          <w:sz w:val="16"/>
+          <w:sz w:val="18"/>
         </w:rPr>
         <w:t>Representative output (Run 1): frequency of A across 10 replicate populations over 100 generations.</w:t>
       </w:r>
@@ -1327,10 +1155,6 @@
     </w:p>
     <w:p>
       <w:r>
-        <w:rPr>
-          <w:i/>
-          <w:color w:val="1F4E79"/>
-        </w:rPr>
         <w:t>Most replicates kept A segregating near 0.1, with at most an occasional loss — very different from Simulation 3 (N = 100), where A was lost in most replicates. The same low starting frequency resolves quickly to loss in a small population but persists in a large one, because drift is much weaker when N is large.</w:t>
       </w:r>
     </w:p>
@@ -1339,7 +1163,6 @@
       <w:r>
         <w:rPr>
           <w:b/>
-          <w:sz w:val="26"/>
         </w:rPr>
         <w:t>SIMULATION 5 — N = 100, f(A) = 0.5, fitness AA = 1.0, Aa = 0.9, aa = 0.9</w:t>
       </w:r>
@@ -1354,10 +1177,6 @@
     </w:p>
     <w:p>
       <w:r>
-        <w:rPr>
-          <w:i/>
-          <w:color w:val="1F4E79"/>
-        </w:rPr>
         <w:t>Selection FOR allele A. The AA genotype has the highest relative fitness (1.0) while both genotypes carrying an a allele are less fit (0.9), so individuals with more A copies survive/reproduce better. I predict A will increase in frequency and fix in most or all replicates.</w:t>
       </w:r>
     </w:p>
@@ -1419,9 +1238,6 @@
           </w:tcPr>
           <w:p>
             <w:r>
-              <w:rPr>
-                <w:color w:val="1F4E79"/>
-              </w:rPr>
               <w:t>9</w:t>
             </w:r>
           </w:p>
@@ -1432,9 +1248,6 @@
           </w:tcPr>
           <w:p>
             <w:r>
-              <w:rPr>
-                <w:color w:val="1F4E79"/>
-              </w:rPr>
               <w:t>0</w:t>
             </w:r>
           </w:p>
@@ -1457,9 +1270,6 @@
           </w:tcPr>
           <w:p>
             <w:r>
-              <w:rPr>
-                <w:color w:val="1F4E79"/>
-              </w:rPr>
               <w:t>10</w:t>
             </w:r>
           </w:p>
@@ -1470,9 +1280,6 @@
           </w:tcPr>
           <w:p>
             <w:r>
-              <w:rPr>
-                <w:color w:val="1F4E79"/>
-              </w:rPr>
               <w:t>0</w:t>
             </w:r>
           </w:p>
@@ -1495,9 +1302,6 @@
           </w:tcPr>
           <w:p>
             <w:r>
-              <w:rPr>
-                <w:color w:val="1F4E79"/>
-              </w:rPr>
               <w:t>10</w:t>
             </w:r>
           </w:p>
@@ -1508,9 +1312,6 @@
           </w:tcPr>
           <w:p>
             <w:r>
-              <w:rPr>
-                <w:color w:val="1F4E79"/>
-              </w:rPr>
               <w:t>0</w:t>
             </w:r>
           </w:p>
@@ -1533,9 +1334,6 @@
           </w:tcPr>
           <w:p>
             <w:r>
-              <w:rPr>
-                <w:color w:val="1F4E79"/>
-              </w:rPr>
               <w:t>10</w:t>
             </w:r>
           </w:p>
@@ -1546,9 +1344,6 @@
           </w:tcPr>
           <w:p>
             <w:r>
-              <w:rPr>
-                <w:color w:val="1F4E79"/>
-              </w:rPr>
               <w:t>0</w:t>
             </w:r>
           </w:p>
@@ -1571,9 +1366,6 @@
           </w:tcPr>
           <w:p>
             <w:r>
-              <w:rPr>
-                <w:color w:val="1F4E79"/>
-              </w:rPr>
               <w:t>10</w:t>
             </w:r>
           </w:p>
@@ -1584,9 +1376,6 @@
           </w:tcPr>
           <w:p>
             <w:r>
-              <w:rPr>
-                <w:color w:val="1F4E79"/>
-              </w:rPr>
               <w:t>0</w:t>
             </w:r>
           </w:p>
@@ -1639,8 +1428,7 @@
       </w:pPr>
       <w:r>
         <w:rPr>
-          <w:i/>
-          <w:sz w:val="16"/>
+          <w:sz w:val="18"/>
         </w:rPr>
         <w:t>Representative output (Run 1): frequency of A across 10 replicate populations over 100 generations.</w:t>
       </w:r>
@@ -1656,10 +1444,6 @@
     </w:p>
     <w:p>
       <w:r>
-        <w:rPr>
-          <w:i/>
-          <w:color w:val="1F4E79"/>
-        </w:rPr>
         <w:t>Allele A fixed in essentially every replicate. Unlike Simulation 1 (neutral, ~50/50 random outcomes), here directional selection consistently drove A to fixation. Selection raised A's fixation probability well above its starting frequency of 0.5.</w:t>
       </w:r>
     </w:p>
@@ -1668,7 +1452,6 @@
       <w:r>
         <w:rPr>
           <w:b/>
-          <w:sz w:val="26"/>
         </w:rPr>
         <w:t>SIMULATION 6 — N = 100, f(A) = 0.5, fitness AA = 1.0, Aa = 0.8, aa = 0.8</w:t>
       </w:r>
@@ -1683,10 +1466,6 @@
     </w:p>
     <w:p>
       <w:r>
-        <w:rPr>
-          <w:i/>
-          <w:color w:val="1F4E79"/>
-        </w:rPr>
         <w:t>The fitness gap is larger (0.8 vs 0.9), so selection for A is stronger. I predict A fixes in all replicates and reaches fixation even faster than in Simulation 5.</w:t>
       </w:r>
     </w:p>
@@ -1748,9 +1527,6 @@
           </w:tcPr>
           <w:p>
             <w:r>
-              <w:rPr>
-                <w:color w:val="1F4E79"/>
-              </w:rPr>
               <w:t>10</w:t>
             </w:r>
           </w:p>
@@ -1761,9 +1537,6 @@
           </w:tcPr>
           <w:p>
             <w:r>
-              <w:rPr>
-                <w:color w:val="1F4E79"/>
-              </w:rPr>
               <w:t>0</w:t>
             </w:r>
           </w:p>
@@ -1786,9 +1559,6 @@
           </w:tcPr>
           <w:p>
             <w:r>
-              <w:rPr>
-                <w:color w:val="1F4E79"/>
-              </w:rPr>
               <w:t>10</w:t>
             </w:r>
           </w:p>
@@ -1799,9 +1569,6 @@
           </w:tcPr>
           <w:p>
             <w:r>
-              <w:rPr>
-                <w:color w:val="1F4E79"/>
-              </w:rPr>
               <w:t>0</w:t>
             </w:r>
           </w:p>
@@ -1824,9 +1591,6 @@
           </w:tcPr>
           <w:p>
             <w:r>
-              <w:rPr>
-                <w:color w:val="1F4E79"/>
-              </w:rPr>
               <w:t>10</w:t>
             </w:r>
           </w:p>
@@ -1837,9 +1601,6 @@
           </w:tcPr>
           <w:p>
             <w:r>
-              <w:rPr>
-                <w:color w:val="1F4E79"/>
-              </w:rPr>
               <w:t>0</w:t>
             </w:r>
           </w:p>
@@ -1862,9 +1623,6 @@
           </w:tcPr>
           <w:p>
             <w:r>
-              <w:rPr>
-                <w:color w:val="1F4E79"/>
-              </w:rPr>
               <w:t>10</w:t>
             </w:r>
           </w:p>
@@ -1875,9 +1633,6 @@
           </w:tcPr>
           <w:p>
             <w:r>
-              <w:rPr>
-                <w:color w:val="1F4E79"/>
-              </w:rPr>
               <w:t>0</w:t>
             </w:r>
           </w:p>
@@ -1900,9 +1655,6 @@
           </w:tcPr>
           <w:p>
             <w:r>
-              <w:rPr>
-                <w:color w:val="1F4E79"/>
-              </w:rPr>
               <w:t>10</w:t>
             </w:r>
           </w:p>
@@ -1913,9 +1665,6 @@
           </w:tcPr>
           <w:p>
             <w:r>
-              <w:rPr>
-                <w:color w:val="1F4E79"/>
-              </w:rPr>
               <w:t>0</w:t>
             </w:r>
           </w:p>
@@ -1968,8 +1717,7 @@
       </w:pPr>
       <w:r>
         <w:rPr>
-          <w:i/>
-          <w:sz w:val="16"/>
+          <w:sz w:val="18"/>
         </w:rPr>
         <w:t>Representative output (Run 1): frequency of A across 10 replicate populations over 100 generations.</w:t>
       </w:r>
@@ -1985,10 +1733,6 @@
     </w:p>
     <w:p>
       <w:r>
-        <w:rPr>
-          <w:i/>
-          <w:color w:val="1F4E79"/>
-        </w:rPr>
         <w:t>A fixed in all replicates, and the stronger selection pushed it to fixation more rapidly than in Simulation 5. Increasing the fitness difference makes selection more effective and fixation of the favored allele more certain.</w:t>
       </w:r>
     </w:p>
@@ -2002,7 +1746,6 @@
       <w:r>
         <w:rPr>
           <w:b/>
-          <w:sz w:val="28"/>
         </w:rPr>
         <w:t>Concluding Questions</w:t>
       </w:r>
@@ -2018,10 +1761,6 @@
     </w:p>
     <w:p>
       <w:r>
-        <w:rPr>
-          <w:i/>
-          <w:color w:val="1F4E79"/>
-        </w:rPr>
         <w:t>Genetic drift is stronger in small populations and weaker in large ones. In a small population, random sampling error each generation is large relative to the population, so allele frequencies swing widely and alleles fix or are lost quickly (Simulations 1 and 3). In a large population the same sampling is averaged over many more individuals, so frequencies change slowly and fixation/loss takes far longer (Simulations 2 and 4). For conservation, this means small or shrinking populations lose genetic variation rapidly to drift.</w:t>
       </w:r>
     </w:p>
@@ -2036,10 +1775,6 @@
     </w:p>
     <w:p>
       <w:r>
-        <w:rPr>
-          <w:i/>
-          <w:color w:val="1F4E79"/>
-        </w:rPr>
         <w:t>For a neutral allele (no selection), the probability that it eventually becomes fixed equals its current frequency in the population: P(fixation) = p, and P(loss) = 1 − p. For example, an allele at frequency 0.1 has about a 10% chance of fixation and a 90% chance of being lost — two sides of the same coin.</w:t>
       </w:r>
     </w:p>
@@ -2054,10 +1789,6 @@
     </w:p>
     <w:p>
       <w:r>
-        <w:rPr>
-          <w:i/>
-          <w:color w:val="1F4E79"/>
-        </w:rPr>
         <w:t>Fitness biases the outcome. A beneficial allele (higher relative fitness) has a fixation probability greater than its starting frequency — selection pushes it toward fixation — and the larger the fitness advantage, the faster and more certain that fixation (Simulations 5 and 6). A deleterious allele has a fixation probability lower than its frequency. The balance between selection and drift depends on which is stronger: strong selection reliably fixes a favored allele (especially in larger populations), while in very small populations drift can still override weak selection and fix a slightly harmful allele or lose a slightly beneficial one.</w:t>
       </w:r>
     </w:p>
@@ -2434,6 +2165,10 @@
     <w:name w:val="Normal"/>
     <w:qFormat/>
     <w:rsid w:val="00FC693F"/>
+    <w:rPr>
+      <w:rFonts w:ascii="Times New Roman" w:hAnsi="Times New Roman"/>
+      <w:sz w:val="24"/>
+    </w:rPr>
   </w:style>
   <w:style w:type="paragraph" w:styleId="Header">
     <w:name w:val="header"/>

</xml_diff>

<commit_message>
Rewrite answers in a casual student voice and remove em dashes
Reword all predictions and explanations to sound conversational, and replace
em dashes (including in section headings) with plain punctuation.
</commit_message>
<xml_diff>
--- a/Lab09_PopGenetics_Completed.docx
+++ b/Lab09_PopGenetics_Completed.docx
@@ -12,7 +12,7 @@
     </w:p>
     <w:p>
       <w:r>
-        <w:t>Exercise worksheet. Simulator: Wright-Fisher drift/selection model (https://evobir.shinyapps.io/wf_model/). Each run uses 10 replicate populations over 100 generations; the tables record how many of the 10 replicates ended with allele A fixed (f(A)=1) or lost (f(A)=0).</w:t>
+        <w:t>Exercise worksheet. Simulator: Wright-Fisher drift/selection model (https://evobir.shinyapps.io/wf_model/). Each run uses 10 replicate populations over 100 generations, and the tables show how many of the 10 replicates ended with allele A fixed (f(A)=1) or lost (f(A)=0).</w:t>
       </w:r>
     </w:p>
     <w:p/>
@@ -21,7 +21,7 @@
         <w:rPr>
           <w:b/>
         </w:rPr>
-        <w:t>SIMULATION 1 — N = 100, initial f(A) = 0.5, all selection coefficients = 1.0</w:t>
+        <w:t>SIMULATION 1: N = 100, initial f(A) = 0.5, all selection coefficients = 1.0</w:t>
       </w:r>
     </w:p>
     <w:tbl>
@@ -274,7 +274,7 @@
         <w:rPr>
           <w:sz w:val="18"/>
         </w:rPr>
-        <w:t>Representative output (Run 1): frequency of A across 10 replicate populations over 100 generations.</w:t>
+        <w:t>Example output (Run 1): frequency of A for the 10 replicate populations over 100 generations.</w:t>
       </w:r>
     </w:p>
     <w:p/>
@@ -288,7 +288,7 @@
     </w:p>
     <w:p>
       <w:r>
-        <w:t>No. Genetic drift is a stochastic (random) process: every generation the next set of alleles is sampled at random from the current pool, so each replicate and each run follows a different random walk. With N = 100 and only 100 generations most replicates are still segregating; among the few that resolve, A fixes about as often as it is lost because the starting frequency is 0.5 (fixation probability = 0.5).</w:t>
+        <w:t>No, I got different numbers basically every time I ran it. That happens because drift is random. Every generation the alleles that get passed on are kind of picked by chance, so each of the 10 lines does its own thing and every run comes out a little different. Since I started at 0.5 and only ran it for 100 generations, most of the replicates were still floating around in the middle and hadn't hit 1 or 0 yet. The few that did finish were about evenly split between A fixing and A getting lost, which makes sense because at 0.5 it has about a 50/50 shot either way.</w:t>
       </w:r>
     </w:p>
     <w:p/>
@@ -297,7 +297,7 @@
         <w:rPr>
           <w:b/>
         </w:rPr>
-        <w:t>SIMULATION 2 — Increase N to 1000, f(A) = 0.5, neutral</w:t>
+        <w:t>SIMULATION 2: increase N to 1000, f(A) = 0.5, neutral</w:t>
       </w:r>
     </w:p>
     <w:p>
@@ -305,12 +305,12 @@
         <w:rPr>
           <w:b/>
         </w:rPr>
-        <w:t>Prediction (what do you predict will happen? why?):</w:t>
+        <w:t>Prediction (what do you predict will happen, and why?):</w:t>
       </w:r>
     </w:p>
     <w:p>
       <w:r>
-        <w:t>Drift is weaker in large populations, so I predict far fewer replicates will reach fixation or loss within 100 generations — most should stay near 0.5.</w:t>
+        <w:t>I think with a bigger population almost nothing is going to fix or get lost. Drift is weaker when N is large, so the frequencies should just sort of hang around 0.5 instead of running all the way up to 1 or down to 0.</w:t>
       </w:r>
     </w:p>
     <w:tbl>
@@ -563,7 +563,7 @@
         <w:rPr>
           <w:sz w:val="18"/>
         </w:rPr>
-        <w:t>Representative output (Run 1): frequency of A across 10 replicate populations over 100 generations.</w:t>
+        <w:t>Example output (Run 1): frequency of A for the 10 replicate populations over 100 generations.</w:t>
       </w:r>
     </w:p>
     <w:p/>
@@ -577,7 +577,7 @@
     </w:p>
     <w:p>
       <w:r>
-        <w:t>Essentially no replicates fixed or were lost; allele frequencies hovered around 0.5. Compared with Simulation 1 (same starting frequency but N = 100, where some replicates fixed/were lost), increasing N suppressed drift. Larger populations experience less sampling error per generation, so allele frequencies change more slowly.</w:t>
+        <w:t>That is pretty much what happened. None of the replicates fixed or got lost, they all stayed close to 0.5. Back in Simulation 1 the population was only 100 and a few of them actually finished, so bumping N up to 1000 basically shut drift down. Bigger populations just don't get pushed around by the random sampling as much.</w:t>
       </w:r>
     </w:p>
     <w:p/>
@@ -586,7 +586,7 @@
         <w:rPr>
           <w:b/>
         </w:rPr>
-        <w:t>SIMULATION 3 — Back to N = 100, set initial f(A) = 0.1, neutral</w:t>
+        <w:t>SIMULATION 3: back to N = 100, set initial f(A) = 0.1, neutral</w:t>
       </w:r>
     </w:p>
     <w:p>
@@ -594,12 +594,12 @@
         <w:rPr>
           <w:b/>
         </w:rPr>
-        <w:t>Prediction (what do you predict will happen? why?):</w:t>
+        <w:t>Prediction (what do you predict will happen, and why?):</w:t>
       </w:r>
     </w:p>
     <w:p>
       <w:r>
-        <w:t>For a neutral allele the probability of fixation equals its initial frequency, so with f(A) = 0.1 only about 1 in 10 replicates should fix A and about 9 in 10 should lose it. I predict mostly losses with the occasional fixation.</w:t>
+        <w:t>Since the allele is starting out rare at 0.1, and for a neutral allele its chance of fixing is just equal to its starting frequency, I am guessing only about 1 out of 10 replicates will fix A and the rest will lose it. So mostly losses.</w:t>
       </w:r>
     </w:p>
     <w:tbl>
@@ -852,7 +852,7 @@
         <w:rPr>
           <w:sz w:val="18"/>
         </w:rPr>
-        <w:t>Representative output (Run 1): frequency of A across 10 replicate populations over 100 generations.</w:t>
+        <w:t>Example output (Run 1): frequency of A for the 10 replicate populations over 100 generations.</w:t>
       </w:r>
     </w:p>
     <w:p/>
@@ -866,7 +866,7 @@
     </w:p>
     <w:p>
       <w:r>
-        <w:t>Allele A was lost in the large majority of replicates and rarely (if ever) fixed, consistent with a fixation probability of about 0.1. Compared with Simulation 1 (start at 0.5, roughly symmetric fix/loss outcomes), starting rarer makes loss far more likely — the starting frequency sets the fixation probability.</w:t>
+        <w:t>Pretty much what I guessed. A got lost in most of the replicates and almost never fixed, which lines up with a fixing chance of around 0.1. Compared to Simulation 1, where it started at 0.5 and the fixing and losing were about even, starting out rare made losing way more likely. So where the allele starts really sets its odds.</w:t>
       </w:r>
     </w:p>
     <w:p/>
@@ -875,7 +875,7 @@
         <w:rPr>
           <w:b/>
         </w:rPr>
-        <w:t>SIMULATION 4 — N = 1000, keep initial f(A) = 0.1, neutral</w:t>
+        <w:t>SIMULATION 4: N = 1000, keep initial f(A) = 0.1, neutral</w:t>
       </w:r>
     </w:p>
     <w:p>
@@ -883,12 +883,12 @@
         <w:rPr>
           <w:b/>
         </w:rPr>
-        <w:t>Prediction (what do you predict will happen? why?):</w:t>
+        <w:t>Prediction (what do you predict will happen, and why?):</w:t>
       </w:r>
     </w:p>
     <w:p>
       <w:r>
-        <w:t>With a large population drift is weak, so frequencies should stay near 0.1 and few replicates should fix or be lost within 100 generations.</w:t>
+        <w:t>Big population again, so drift should be weak. I think the frequency is just going to sit around 0.1 and not many of the replicates will fix or lose A in only 100 generations.</w:t>
       </w:r>
     </w:p>
     <w:tbl>
@@ -1141,7 +1141,7 @@
         <w:rPr>
           <w:sz w:val="18"/>
         </w:rPr>
-        <w:t>Representative output (Run 1): frequency of A across 10 replicate populations over 100 generations.</w:t>
+        <w:t>Example output (Run 1): frequency of A for the 10 replicate populations over 100 generations.</w:t>
       </w:r>
     </w:p>
     <w:p/>
@@ -1155,7 +1155,7 @@
     </w:p>
     <w:p>
       <w:r>
-        <w:t>Most replicates kept A segregating near 0.1, with at most an occasional loss — very different from Simulation 3 (N = 100), where A was lost in most replicates. The same low starting frequency resolves quickly to loss in a small population but persists in a large one, because drift is much weaker when N is large.</w:t>
+        <w:t>That is what I saw. Most of them just stayed near 0.1, with maybe one loss here and there. That is really different from Simulation 3, where N was 100 and A got lost a ton. Same starting point, but in a small population it gets lost fast and in a big one it just hangs on, because drift is so much weaker when N is large.</w:t>
       </w:r>
     </w:p>
     <w:p/>
@@ -1164,7 +1164,7 @@
         <w:rPr>
           <w:b/>
         </w:rPr>
-        <w:t>SIMULATION 5 — N = 100, f(A) = 0.5, fitness AA = 1.0, Aa = 0.9, aa = 0.9</w:t>
+        <w:t>SIMULATION 5: N = 100, f(A) = 0.5, fitness AA = 1.0, Aa = 0.9, aa = 0.9</w:t>
       </w:r>
     </w:p>
     <w:p>
@@ -1177,7 +1177,7 @@
     </w:p>
     <w:p>
       <w:r>
-        <w:t>Selection FOR allele A. The AA genotype has the highest relative fitness (1.0) while both genotypes carrying an a allele are less fit (0.9), so individuals with more A copies survive/reproduce better. I predict A will increase in frequency and fix in most or all replicates.</w:t>
+        <w:t>This is selection for allele A. AA has the highest fitness at 1.0 and anything with an a in it is lower at 0.9, so having more A copies is better for you. I think A is going to take over and fix in basically all of the replicates.</w:t>
       </w:r>
     </w:p>
     <w:tbl>
@@ -1430,7 +1430,7 @@
         <w:rPr>
           <w:sz w:val="18"/>
         </w:rPr>
-        <w:t>Representative output (Run 1): frequency of A across 10 replicate populations over 100 generations.</w:t>
+        <w:t>Example output (Run 1): frequency of A for the 10 replicate populations over 100 generations.</w:t>
       </w:r>
     </w:p>
     <w:p/>
@@ -1444,7 +1444,7 @@
     </w:p>
     <w:p>
       <w:r>
-        <w:t>Allele A fixed in essentially every replicate. Unlike Simulation 1 (neutral, ~50/50 random outcomes), here directional selection consistently drove A to fixation. Selection raised A's fixation probability well above its starting frequency of 0.5.</w:t>
+        <w:t>Yep, A fixed in almost every single replicate. That is super different from Simulation 1, which was neutral and came out random like a coin flip. Here selection just kept pushing A up until it took over. So selection bumped A's chance of fixing way above the 0.5 it started at.</w:t>
       </w:r>
     </w:p>
     <w:p/>
@@ -1453,7 +1453,7 @@
         <w:rPr>
           <w:b/>
         </w:rPr>
-        <w:t>SIMULATION 6 — N = 100, f(A) = 0.5, fitness AA = 1.0, Aa = 0.8, aa = 0.8</w:t>
+        <w:t>SIMULATION 6: N = 100, f(A) = 0.5, fitness AA = 1.0, Aa = 0.8, aa = 0.8</w:t>
       </w:r>
     </w:p>
     <w:p>
@@ -1461,12 +1461,12 @@
         <w:rPr>
           <w:b/>
         </w:rPr>
-        <w:t>Prediction (what do you predict will happen? why?):</w:t>
+        <w:t>Prediction (what do you predict will happen, and why?):</w:t>
       </w:r>
     </w:p>
     <w:p>
       <w:r>
-        <w:t>The fitness gap is larger (0.8 vs 0.9), so selection for A is stronger. I predict A fixes in all replicates and reaches fixation even faster than in Simulation 5.</w:t>
+        <w:t>Now the fitness gap is even bigger (0.8 instead of 0.9), so selection for A is stronger. I am guessing A fixes in all of them and gets there even faster than last time.</w:t>
       </w:r>
     </w:p>
     <w:tbl>
@@ -1719,7 +1719,7 @@
         <w:rPr>
           <w:sz w:val="18"/>
         </w:rPr>
-        <w:t>Representative output (Run 1): frequency of A across 10 replicate populations over 100 generations.</w:t>
+        <w:t>Example output (Run 1): frequency of A for the 10 replicate populations over 100 generations.</w:t>
       </w:r>
     </w:p>
     <w:p/>
@@ -1733,7 +1733,7 @@
     </w:p>
     <w:p>
       <w:r>
-        <w:t>A fixed in all replicates, and the stronger selection pushed it to fixation more rapidly than in Simulation 5. Increasing the fitness difference makes selection more effective and fixation of the favored allele more certain.</w:t>
+        <w:t>That is what happened. A fixed in every replicate and it got there quicker than in Simulation 5. Making the fitness difference bigger just makes selection more powerful, so the better allele takes over faster and it is basically a sure thing.</w:t>
       </w:r>
     </w:p>
     <w:p/>
@@ -1761,7 +1761,7 @@
     </w:p>
     <w:p>
       <w:r>
-        <w:t>Genetic drift is stronger in small populations and weaker in large ones. In a small population, random sampling error each generation is large relative to the population, so allele frequencies swing widely and alleles fix or are lost quickly (Simulations 1 and 3). In a large population the same sampling is averaged over many more individuals, so frequencies change slowly and fixation/loss takes far longer (Simulations 2 and 4). For conservation, this means small or shrinking populations lose genetic variation rapidly to drift.</w:t>
+        <w:t>Population size has a big effect on drift. In small populations drift is strong, so the allele frequencies bounce around a lot and an allele can fix or disappear pretty fast, like in Simulations 1 and 3. In big populations drift is weak, because the random sampling gets averaged out over way more individuals, so the frequencies barely move and it takes forever for anything to fix or get lost, like in Simulations 2 and 4. For conservation this is kind of scary, because small or shrinking populations lose their genetic variation really fast just from random chance.</w:t>
       </w:r>
     </w:p>
     <w:p/>
@@ -1775,7 +1775,7 @@
     </w:p>
     <w:p>
       <w:r>
-        <w:t>For a neutral allele (no selection), the probability that it eventually becomes fixed equals its current frequency in the population: P(fixation) = p, and P(loss) = 1 − p. For example, an allele at frequency 0.1 has about a 10% chance of fixation and a 90% chance of being lost — two sides of the same coin.</w:t>
+        <w:t>For a neutral allele with no selection, the chance it eventually fixes is just equal to how common it already is. So if its frequency is p, the chance it fixes is p and the chance it gets lost is 1 minus p. For example, an allele sitting at 0.1 has about a 10% chance of fixing and a 90% chance of getting lost. They are two sides of the same coin.</w:t>
       </w:r>
     </w:p>
     <w:p/>
@@ -1789,7 +1789,7 @@
     </w:p>
     <w:p>
       <w:r>
-        <w:t>Fitness biases the outcome. A beneficial allele (higher relative fitness) has a fixation probability greater than its starting frequency — selection pushes it toward fixation — and the larger the fitness advantage, the faster and more certain that fixation (Simulations 5 and 6). A deleterious allele has a fixation probability lower than its frequency. The balance between selection and drift depends on which is stronger: strong selection reliably fixes a favored allele (especially in larger populations), while in very small populations drift can still override weak selection and fix a slightly harmful allele or lose a slightly beneficial one.</w:t>
+        <w:t>Fitness tips the odds. If an allele is good for you (higher fitness), its chance of fixing is better than just its starting frequency, because selection keeps pushing it up, and the bigger the advantage the faster and more certain it fixes, like in Simulations 5 and 6. If an allele is bad for you, its chance of fixing is lower than its frequency. It also comes down to a tug of war between selection and drift. If selection is strong it usually wins and fixes the better allele, especially in bigger populations. But in really small populations drift can be strong enough to override weak selection, so you can actually lose a good allele or fix a slightly bad one just by chance.</w:t>
       </w:r>
     </w:p>
     <w:sectPr>

</xml_diff>